<commit_message>
adding anti plague guiode and remaking lab3
</commit_message>
<xml_diff>
--- a/physics/lab2/Фізика_ЛР-2_Цебринський_Назар_ІМ-44.docx
+++ b/physics/lab2/Фізика_ЛР-2_Цебринський_Назар_ІМ-44.docx
@@ -2060,8 +2060,8 @@
         <w:tblLook w:val="04a0" w:noHBand="0" w:noVBand="1" w:firstColumn="1" w:lastRow="0" w:lastColumn="0" w:firstRow="1"/>
       </w:tblPr>
       <w:tblGrid>
-        <w:gridCol w:w="1519"/>
-        <w:gridCol w:w="1523"/>
+        <w:gridCol w:w="1518"/>
+        <w:gridCol w:w="1524"/>
         <w:gridCol w:w="1522"/>
         <w:gridCol w:w="1524"/>
         <w:gridCol w:w="1520"/>
@@ -2205,7 +2205,7 @@
         </w:trPr>
         <w:tc>
           <w:tcPr>
-            <w:tcW w:w="1519" w:type="dxa"/>
+            <w:tcW w:w="1518" w:type="dxa"/>
             <w:tcBorders/>
           </w:tcPr>
           <w:p>
@@ -2229,7 +2229,7 @@
         </w:tc>
         <w:tc>
           <w:tcPr>
-            <w:tcW w:w="1523" w:type="dxa"/>
+            <w:tcW w:w="1524" w:type="dxa"/>
             <w:tcBorders/>
           </w:tcPr>
           <w:p>
@@ -2442,7 +2442,7 @@
         </w:trPr>
         <w:tc>
           <w:tcPr>
-            <w:tcW w:w="1519" w:type="dxa"/>
+            <w:tcW w:w="1518" w:type="dxa"/>
             <w:tcBorders/>
           </w:tcPr>
           <w:p>
@@ -2470,7 +2470,7 @@
         </w:tc>
         <w:tc>
           <w:tcPr>
-            <w:tcW w:w="1523" w:type="dxa"/>
+            <w:tcW w:w="1524" w:type="dxa"/>
             <w:tcBorders/>
           </w:tcPr>
           <w:p>
@@ -2611,7 +2611,7 @@
         </w:trPr>
         <w:tc>
           <w:tcPr>
-            <w:tcW w:w="1519" w:type="dxa"/>
+            <w:tcW w:w="1518" w:type="dxa"/>
             <w:tcBorders/>
           </w:tcPr>
           <w:p>
@@ -2639,7 +2639,7 @@
         </w:tc>
         <w:tc>
           <w:tcPr>
-            <w:tcW w:w="1523" w:type="dxa"/>
+            <w:tcW w:w="1524" w:type="dxa"/>
             <w:tcBorders/>
           </w:tcPr>
           <w:p>
@@ -2780,7 +2780,7 @@
         </w:trPr>
         <w:tc>
           <w:tcPr>
-            <w:tcW w:w="1519" w:type="dxa"/>
+            <w:tcW w:w="1518" w:type="dxa"/>
             <w:tcBorders/>
           </w:tcPr>
           <w:p>
@@ -2825,7 +2825,7 @@
         </w:tc>
         <w:tc>
           <w:tcPr>
-            <w:tcW w:w="1523" w:type="dxa"/>
+            <w:tcW w:w="1524" w:type="dxa"/>
             <w:tcBorders/>
           </w:tcPr>
           <w:p>
@@ -3231,8 +3231,8 @@
         <w:tblLook w:val="04a0" w:noHBand="0" w:noVBand="1" w:firstColumn="1" w:lastRow="0" w:lastColumn="0" w:firstRow="1"/>
       </w:tblPr>
       <w:tblGrid>
-        <w:gridCol w:w="1519"/>
-        <w:gridCol w:w="1523"/>
+        <w:gridCol w:w="1518"/>
+        <w:gridCol w:w="1524"/>
         <w:gridCol w:w="1522"/>
         <w:gridCol w:w="1524"/>
         <w:gridCol w:w="1520"/>
@@ -3376,7 +3376,7 @@
         </w:trPr>
         <w:tc>
           <w:tcPr>
-            <w:tcW w:w="1519" w:type="dxa"/>
+            <w:tcW w:w="1518" w:type="dxa"/>
             <w:tcBorders/>
           </w:tcPr>
           <w:p>
@@ -3400,7 +3400,7 @@
         </w:tc>
         <w:tc>
           <w:tcPr>
-            <w:tcW w:w="1523" w:type="dxa"/>
+            <w:tcW w:w="1524" w:type="dxa"/>
             <w:tcBorders/>
           </w:tcPr>
           <w:p>
@@ -3613,7 +3613,7 @@
         </w:trPr>
         <w:tc>
           <w:tcPr>
-            <w:tcW w:w="1519" w:type="dxa"/>
+            <w:tcW w:w="1518" w:type="dxa"/>
             <w:tcBorders/>
           </w:tcPr>
           <w:p>
@@ -3641,7 +3641,7 @@
         </w:tc>
         <w:tc>
           <w:tcPr>
-            <w:tcW w:w="1523" w:type="dxa"/>
+            <w:tcW w:w="1524" w:type="dxa"/>
             <w:tcBorders/>
           </w:tcPr>
           <w:p>
@@ -3781,7 +3781,7 @@
         </w:trPr>
         <w:tc>
           <w:tcPr>
-            <w:tcW w:w="1519" w:type="dxa"/>
+            <w:tcW w:w="1518" w:type="dxa"/>
             <w:tcBorders/>
           </w:tcPr>
           <w:p>
@@ -3809,7 +3809,7 @@
         </w:tc>
         <w:tc>
           <w:tcPr>
-            <w:tcW w:w="1523" w:type="dxa"/>
+            <w:tcW w:w="1524" w:type="dxa"/>
             <w:tcBorders/>
           </w:tcPr>
           <w:p>
@@ -3950,7 +3950,7 @@
         </w:trPr>
         <w:tc>
           <w:tcPr>
-            <w:tcW w:w="1519" w:type="dxa"/>
+            <w:tcW w:w="1518" w:type="dxa"/>
             <w:tcBorders/>
           </w:tcPr>
           <w:p>
@@ -3995,7 +3995,7 @@
         </w:tc>
         <w:tc>
           <w:tcPr>
-            <w:tcW w:w="1523" w:type="dxa"/>
+            <w:tcW w:w="1524" w:type="dxa"/>
             <w:tcBorders/>
           </w:tcPr>
           <w:p>
@@ -4404,8 +4404,8 @@
         <w:tblLook w:val="04a0" w:noHBand="0" w:noVBand="1" w:firstColumn="1" w:lastRow="0" w:lastColumn="0" w:firstRow="1"/>
       </w:tblPr>
       <w:tblGrid>
-        <w:gridCol w:w="1519"/>
-        <w:gridCol w:w="1523"/>
+        <w:gridCol w:w="1518"/>
+        <w:gridCol w:w="1524"/>
         <w:gridCol w:w="1522"/>
         <w:gridCol w:w="1524"/>
         <w:gridCol w:w="1520"/>
@@ -4549,7 +4549,7 @@
         </w:trPr>
         <w:tc>
           <w:tcPr>
-            <w:tcW w:w="1519" w:type="dxa"/>
+            <w:tcW w:w="1518" w:type="dxa"/>
             <w:tcBorders/>
           </w:tcPr>
           <w:p>
@@ -4573,7 +4573,7 @@
         </w:tc>
         <w:tc>
           <w:tcPr>
-            <w:tcW w:w="1523" w:type="dxa"/>
+            <w:tcW w:w="1524" w:type="dxa"/>
             <w:tcBorders/>
           </w:tcPr>
           <w:p>
@@ -4786,7 +4786,7 @@
         </w:trPr>
         <w:tc>
           <w:tcPr>
-            <w:tcW w:w="1519" w:type="dxa"/>
+            <w:tcW w:w="1518" w:type="dxa"/>
             <w:tcBorders/>
           </w:tcPr>
           <w:p>
@@ -4814,7 +4814,7 @@
         </w:tc>
         <w:tc>
           <w:tcPr>
-            <w:tcW w:w="1523" w:type="dxa"/>
+            <w:tcW w:w="1524" w:type="dxa"/>
             <w:tcBorders/>
           </w:tcPr>
           <w:p>
@@ -4955,7 +4955,7 @@
         </w:trPr>
         <w:tc>
           <w:tcPr>
-            <w:tcW w:w="1519" w:type="dxa"/>
+            <w:tcW w:w="1518" w:type="dxa"/>
             <w:tcBorders/>
           </w:tcPr>
           <w:p>
@@ -4983,7 +4983,7 @@
         </w:tc>
         <w:tc>
           <w:tcPr>
-            <w:tcW w:w="1523" w:type="dxa"/>
+            <w:tcW w:w="1524" w:type="dxa"/>
             <w:tcBorders/>
           </w:tcPr>
           <w:p>
@@ -5124,7 +5124,7 @@
         </w:trPr>
         <w:tc>
           <w:tcPr>
-            <w:tcW w:w="1519" w:type="dxa"/>
+            <w:tcW w:w="1518" w:type="dxa"/>
             <w:tcBorders/>
           </w:tcPr>
           <w:p>
@@ -5169,7 +5169,7 @@
         </w:tc>
         <w:tc>
           <w:tcPr>
-            <w:tcW w:w="1523" w:type="dxa"/>
+            <w:tcW w:w="1524" w:type="dxa"/>
             <w:tcBorders/>
           </w:tcPr>
           <w:p>
@@ -5585,8 +5585,8 @@
         <w:tblLook w:val="04a0" w:noHBand="0" w:noVBand="1" w:firstColumn="1" w:lastRow="0" w:lastColumn="0" w:firstRow="1"/>
       </w:tblPr>
       <w:tblGrid>
-        <w:gridCol w:w="1519"/>
-        <w:gridCol w:w="1523"/>
+        <w:gridCol w:w="1518"/>
+        <w:gridCol w:w="1524"/>
         <w:gridCol w:w="1522"/>
         <w:gridCol w:w="1524"/>
         <w:gridCol w:w="1520"/>
@@ -5730,7 +5730,7 @@
         </w:trPr>
         <w:tc>
           <w:tcPr>
-            <w:tcW w:w="1519" w:type="dxa"/>
+            <w:tcW w:w="1518" w:type="dxa"/>
             <w:tcBorders/>
           </w:tcPr>
           <w:p>
@@ -5754,7 +5754,7 @@
         </w:tc>
         <w:tc>
           <w:tcPr>
-            <w:tcW w:w="1523" w:type="dxa"/>
+            <w:tcW w:w="1524" w:type="dxa"/>
             <w:tcBorders/>
           </w:tcPr>
           <w:p>
@@ -5967,7 +5967,7 @@
         </w:trPr>
         <w:tc>
           <w:tcPr>
-            <w:tcW w:w="1519" w:type="dxa"/>
+            <w:tcW w:w="1518" w:type="dxa"/>
             <w:tcBorders/>
           </w:tcPr>
           <w:p>
@@ -5995,7 +5995,7 @@
         </w:tc>
         <w:tc>
           <w:tcPr>
-            <w:tcW w:w="1523" w:type="dxa"/>
+            <w:tcW w:w="1524" w:type="dxa"/>
             <w:tcBorders/>
           </w:tcPr>
           <w:p>
@@ -6136,7 +6136,7 @@
         </w:trPr>
         <w:tc>
           <w:tcPr>
-            <w:tcW w:w="1519" w:type="dxa"/>
+            <w:tcW w:w="1518" w:type="dxa"/>
             <w:tcBorders/>
           </w:tcPr>
           <w:p>
@@ -6164,7 +6164,7 @@
         </w:tc>
         <w:tc>
           <w:tcPr>
-            <w:tcW w:w="1523" w:type="dxa"/>
+            <w:tcW w:w="1524" w:type="dxa"/>
             <w:tcBorders/>
           </w:tcPr>
           <w:p>
@@ -6305,7 +6305,7 @@
         </w:trPr>
         <w:tc>
           <w:tcPr>
-            <w:tcW w:w="1519" w:type="dxa"/>
+            <w:tcW w:w="1518" w:type="dxa"/>
             <w:tcBorders/>
           </w:tcPr>
           <w:p>
@@ -6350,7 +6350,7 @@
         </w:tc>
         <w:tc>
           <w:tcPr>
-            <w:tcW w:w="1523" w:type="dxa"/>
+            <w:tcW w:w="1524" w:type="dxa"/>
             <w:tcBorders/>
           </w:tcPr>
           <w:p>
@@ -7940,6 +7940,337 @@
           <w:szCs w:val="28"/>
         </w:rPr>
         <w:t>Під час виконання віртуального експерименту було практично досліджено принцип роботи інтегруючого балістичного гальванометра як вимірювача електричного заряду. Шляхом порівняння відхилень світлового штриха при розряді еталонного та досліджуваних конденсаторів вдалося визначити чотири невідомі ємності: 0,153 мкФ, 0,530 мкФ, 0,883 мкФ та 1,225 мкФ. Отримані мінімальні відносні похибки (від 0,00% до 0,82%) підтверджують високу надійність балістичного методу. Незначні розбіжності між номінальними та експериментальними значеннями зумовлені виключно апаратною похибкою, яка штучно закладена в програмний симулятор для імітації умов роботи з реальним фізичним стендом.</w:t>
+      </w:r>
+    </w:p>
+    <w:p>
+      <w:pPr>
+        <w:pStyle w:val="Normal"/>
+        <w:spacing w:lineRule="auto" w:line="276" w:before="0" w:after="191"/>
+        <w:ind w:firstLine="285" w:left="0"/>
+        <w:rPr>
+          <w:szCs w:val="28"/>
+        </w:rPr>
+      </w:pPr>
+      <w:r>
+        <w:rPr>
+          <w:szCs w:val="28"/>
+        </w:rPr>
+      </w:r>
+    </w:p>
+    <w:p>
+      <w:pPr>
+        <w:pStyle w:val="Normal"/>
+        <w:spacing w:lineRule="auto" w:line="276" w:before="0" w:after="191"/>
+        <w:ind w:firstLine="285" w:left="0"/>
+        <w:rPr>
+          <w:szCs w:val="28"/>
+        </w:rPr>
+      </w:pPr>
+      <w:r>
+        <w:rPr>
+          <w:szCs w:val="28"/>
+        </w:rPr>
+      </w:r>
+    </w:p>
+    <w:p>
+      <w:pPr>
+        <w:pStyle w:val="Normal"/>
+        <w:spacing w:lineRule="auto" w:line="276" w:before="0" w:after="191"/>
+        <w:ind w:firstLine="285" w:left="0"/>
+        <w:rPr>
+          <w:szCs w:val="28"/>
+        </w:rPr>
+      </w:pPr>
+      <w:r>
+        <w:rPr>
+          <w:szCs w:val="28"/>
+        </w:rPr>
+      </w:r>
+    </w:p>
+    <w:p>
+      <w:pPr>
+        <w:pStyle w:val="Normal"/>
+        <w:spacing w:lineRule="auto" w:line="276" w:before="0" w:after="191"/>
+        <w:ind w:firstLine="285" w:left="0"/>
+        <w:rPr>
+          <w:szCs w:val="28"/>
+        </w:rPr>
+      </w:pPr>
+      <w:r>
+        <w:rPr>
+          <w:szCs w:val="28"/>
+        </w:rPr>
+      </w:r>
+    </w:p>
+    <w:p>
+      <w:pPr>
+        <w:pStyle w:val="Normal"/>
+        <w:spacing w:lineRule="auto" w:line="276" w:before="0" w:after="191"/>
+        <w:ind w:firstLine="285" w:left="0"/>
+        <w:rPr>
+          <w:szCs w:val="28"/>
+        </w:rPr>
+      </w:pPr>
+      <w:r>
+        <w:rPr>
+          <w:szCs w:val="28"/>
+        </w:rPr>
+      </w:r>
+    </w:p>
+    <w:p>
+      <w:pPr>
+        <w:pStyle w:val="Normal"/>
+        <w:spacing w:lineRule="auto" w:line="276" w:before="0" w:after="191"/>
+        <w:ind w:firstLine="285" w:left="0"/>
+        <w:rPr>
+          <w:szCs w:val="28"/>
+        </w:rPr>
+      </w:pPr>
+      <w:r>
+        <w:rPr>
+          <w:szCs w:val="28"/>
+        </w:rPr>
+      </w:r>
+    </w:p>
+    <w:p>
+      <w:pPr>
+        <w:pStyle w:val="Normal"/>
+        <w:spacing w:lineRule="auto" w:line="276" w:before="0" w:after="191"/>
+        <w:ind w:firstLine="285" w:left="0"/>
+        <w:rPr>
+          <w:szCs w:val="28"/>
+        </w:rPr>
+      </w:pPr>
+      <w:r>
+        <w:rPr>
+          <w:szCs w:val="28"/>
+        </w:rPr>
+      </w:r>
+    </w:p>
+    <w:p>
+      <w:pPr>
+        <w:pStyle w:val="Normal"/>
+        <w:spacing w:lineRule="auto" w:line="276" w:before="0" w:after="191"/>
+        <w:ind w:firstLine="285" w:left="0"/>
+        <w:rPr>
+          <w:szCs w:val="28"/>
+        </w:rPr>
+      </w:pPr>
+      <w:r>
+        <w:rPr>
+          <w:szCs w:val="28"/>
+        </w:rPr>
+      </w:r>
+    </w:p>
+    <w:p>
+      <w:pPr>
+        <w:pStyle w:val="Normal"/>
+        <w:spacing w:lineRule="auto" w:line="276" w:before="0" w:after="191"/>
+        <w:ind w:firstLine="285" w:left="0"/>
+        <w:rPr>
+          <w:szCs w:val="28"/>
+        </w:rPr>
+      </w:pPr>
+      <w:r>
+        <w:rPr>
+          <w:szCs w:val="28"/>
+        </w:rPr>
+      </w:r>
+    </w:p>
+    <w:p>
+      <w:pPr>
+        <w:pStyle w:val="Normal"/>
+        <w:spacing w:lineRule="auto" w:line="276" w:before="0" w:after="191"/>
+        <w:ind w:firstLine="285" w:left="0"/>
+        <w:rPr>
+          <w:szCs w:val="28"/>
+        </w:rPr>
+      </w:pPr>
+      <w:r>
+        <w:rPr>
+          <w:szCs w:val="28"/>
+        </w:rPr>
+      </w:r>
+    </w:p>
+    <w:p>
+      <w:pPr>
+        <w:pStyle w:val="Normal"/>
+        <w:spacing w:lineRule="auto" w:line="276" w:before="0" w:after="191"/>
+        <w:ind w:firstLine="285" w:left="0"/>
+        <w:rPr>
+          <w:szCs w:val="28"/>
+        </w:rPr>
+      </w:pPr>
+      <w:r>
+        <w:rPr>
+          <w:szCs w:val="28"/>
+        </w:rPr>
+      </w:r>
+    </w:p>
+    <w:p>
+      <w:pPr>
+        <w:pStyle w:val="Normal"/>
+        <w:spacing w:lineRule="auto" w:line="276" w:before="0" w:after="191"/>
+        <w:ind w:firstLine="285" w:left="0"/>
+        <w:rPr>
+          <w:szCs w:val="28"/>
+        </w:rPr>
+      </w:pPr>
+      <w:r>
+        <w:rPr>
+          <w:szCs w:val="28"/>
+        </w:rPr>
+      </w:r>
+    </w:p>
+    <w:p>
+      <w:pPr>
+        <w:pStyle w:val="Normal"/>
+        <w:spacing w:lineRule="auto" w:line="276" w:before="0" w:after="191"/>
+        <w:ind w:firstLine="285" w:left="0"/>
+        <w:rPr>
+          <w:szCs w:val="28"/>
+        </w:rPr>
+      </w:pPr>
+      <w:r>
+        <w:rPr>
+          <w:szCs w:val="28"/>
+        </w:rPr>
+      </w:r>
+    </w:p>
+    <w:p>
+      <w:pPr>
+        <w:pStyle w:val="Normal"/>
+        <w:spacing w:lineRule="auto" w:line="276" w:before="0" w:after="191"/>
+        <w:ind w:firstLine="285" w:left="0"/>
+        <w:rPr>
+          <w:szCs w:val="28"/>
+        </w:rPr>
+      </w:pPr>
+      <w:r>
+        <w:rPr>
+          <w:szCs w:val="28"/>
+        </w:rPr>
+      </w:r>
+    </w:p>
+    <w:p>
+      <w:pPr>
+        <w:pStyle w:val="Normal"/>
+        <w:spacing w:lineRule="auto" w:line="276" w:before="0" w:after="191"/>
+        <w:ind w:firstLine="285" w:left="0"/>
+        <w:rPr>
+          <w:szCs w:val="28"/>
+        </w:rPr>
+      </w:pPr>
+      <w:r>
+        <w:rPr>
+          <w:szCs w:val="28"/>
+        </w:rPr>
+      </w:r>
+    </w:p>
+    <w:p>
+      <w:pPr>
+        <w:pStyle w:val="Normal"/>
+        <w:spacing w:lineRule="auto" w:line="276" w:before="0" w:after="191"/>
+        <w:ind w:firstLine="285" w:left="0"/>
+        <w:rPr>
+          <w:szCs w:val="28"/>
+        </w:rPr>
+      </w:pPr>
+      <w:r>
+        <w:rPr>
+          <w:szCs w:val="28"/>
+        </w:rPr>
+      </w:r>
+    </w:p>
+    <w:p>
+      <w:pPr>
+        <w:pStyle w:val="Normal"/>
+        <w:spacing w:lineRule="auto" w:line="276" w:before="0" w:after="191"/>
+        <w:ind w:firstLine="285" w:left="0"/>
+        <w:rPr>
+          <w:szCs w:val="28"/>
+        </w:rPr>
+      </w:pPr>
+      <w:r>
+        <w:rPr>
+          <w:szCs w:val="28"/>
+        </w:rPr>
+      </w:r>
+    </w:p>
+    <w:p>
+      <w:pPr>
+        <w:pStyle w:val="Normal"/>
+        <w:spacing w:lineRule="auto" w:line="276" w:before="0" w:after="191"/>
+        <w:ind w:firstLine="285" w:left="0"/>
+        <w:rPr>
+          <w:szCs w:val="28"/>
+        </w:rPr>
+      </w:pPr>
+      <w:r>
+        <w:rPr>
+          <w:szCs w:val="28"/>
+        </w:rPr>
+      </w:r>
+    </w:p>
+    <w:p>
+      <w:pPr>
+        <w:pStyle w:val="Normal"/>
+        <w:spacing w:lineRule="auto" w:line="276" w:before="0" w:after="191"/>
+        <w:ind w:firstLine="285" w:left="0"/>
+        <w:rPr>
+          <w:szCs w:val="28"/>
+        </w:rPr>
+      </w:pPr>
+      <w:r>
+        <w:rPr>
+          <w:szCs w:val="28"/>
+        </w:rPr>
+        <w:drawing>
+          <wp:anchor behindDoc="0" distT="0" distB="0" distL="0" distR="0" simplePos="0" locked="0" layoutInCell="0" allowOverlap="1" relativeHeight="10">
+            <wp:simplePos x="0" y="0"/>
+            <wp:positionH relativeFrom="column">
+              <wp:align>center</wp:align>
+            </wp:positionH>
+            <wp:positionV relativeFrom="paragraph">
+              <wp:posOffset>635</wp:posOffset>
+            </wp:positionV>
+            <wp:extent cx="6106795" cy="8111490"/>
+            <wp:effectExtent l="0" t="0" r="0" b="0"/>
+            <wp:wrapSquare wrapText="largest"/>
+            <wp:docPr id="4" name="Image1" descr=""/>
+            <wp:cNvGraphicFramePr>
+              <a:graphicFrameLocks xmlns:a="http://schemas.openxmlformats.org/drawingml/2006/main" noChangeAspect="1"/>
+            </wp:cNvGraphicFramePr>
+            <a:graphic xmlns:a="http://schemas.openxmlformats.org/drawingml/2006/main">
+              <a:graphicData uri="http://schemas.openxmlformats.org/drawingml/2006/picture">
+                <pic:pic xmlns:pic="http://schemas.openxmlformats.org/drawingml/2006/picture">
+                  <pic:nvPicPr>
+                    <pic:cNvPr id="4" name="Image1" descr=""/>
+                    <pic:cNvPicPr>
+                      <a:picLocks noChangeAspect="1" noChangeArrowheads="1"/>
+                    </pic:cNvPicPr>
+                  </pic:nvPicPr>
+                  <pic:blipFill>
+                    <a:blip r:embed="rId5"/>
+                    <a:stretch>
+                      <a:fillRect/>
+                    </a:stretch>
+                  </pic:blipFill>
+                  <pic:spPr bwMode="auto">
+                    <a:xfrm>
+                      <a:off x="0" y="0"/>
+                      <a:ext cx="6106795" cy="8111490"/>
+                    </a:xfrm>
+                    <a:prstGeom prst="rect">
+                      <a:avLst/>
+                    </a:prstGeom>
+                    <a:noFill/>
+                  </pic:spPr>
+                </pic:pic>
+              </a:graphicData>
+            </a:graphic>
+          </wp:anchor>
+        </w:drawing>
       </w:r>
     </w:p>
     <w:sectPr>
@@ -9316,8 +9647,8 @@
       <w:color w:val="808080"/>
     </w:rPr>
   </w:style>
-  <w:style w:type="character" w:styleId="Bulletsuser">
-    <w:name w:val="Bullets (user)"/>
+  <w:style w:type="character" w:styleId="Bullets">
+    <w:name w:val="Bullets"/>
     <w:qFormat/>
     <w:rPr>
       <w:rFonts w:ascii="OpenSymbol" w:hAnsi="OpenSymbol" w:eastAsia="OpenSymbol" w:cs="OpenSymbol"/>

</xml_diff>